<commit_message>
feat: integrate LinkedIn data (SecureVerse Founder, BioShield AI, AI Safety) and update demo documentation
</commit_message>
<xml_diff>
--- a/sample_data/generated_resumes/Resume_AI_MultiAgent_Engineer.docx
+++ b/sample_data/generated_resumes/Resume_AI_MultiAgent_Engineer.docx
@@ -27,7 +27,7 @@
           <w:color w:val="2563EB"/>
           <w:sz w:val="22"/>
         </w:rPr>
-        <w:t>AI Systems &amp; Multi-Agent Infrastructure Engineer</w:t>
+        <w:t>Senior Multi-Agent AI &amp; Safety Systems Engineer</w:t>
       </w:r>
     </w:p>
     <w:p>
@@ -72,7 +72,7 @@
           <w:rFonts w:ascii="Calibri" w:hAnsi="Calibri"/>
           <w:sz w:val="19"/>
         </w:rPr>
-        <w:t>AI Systems &amp; Backend Architect specializing in multi-agent orchestration, decoupled mediation topologies, and LLM intent routing. Engineered F.R.I.D.A.Y (3-agent decoupled backend) and EduOS curiosity engine, emphasizing ground-truth verification over unverified generation. Adept at constructing reliable, auditable agent pipelines with zero circular dependencies.</w:t>
+        <w:t>Distributed systems architect and Founder of SecureVerse specializing in multi-agent orchestration, LLM intent routing, predictive computational modeling, and AI safety verification pipelines.</w:t>
       </w:r>
     </w:p>
     <w:p>
@@ -109,7 +109,7 @@
           <w:rFonts w:ascii="Calibri" w:hAnsi="Calibri"/>
           <w:sz w:val="19"/>
         </w:rPr>
-        <w:t>Python, TypeScript / JavaScript, SQL (PostgreSQL, SQLite)</w:t>
+        <w:t>Python, C++, TypeScript / JavaScript, SQL (PostgreSQL, SQLite), Bash / Shell Scripting</w:t>
       </w:r>
     </w:p>
     <w:p>
@@ -129,7 +129,7 @@
           <w:rFonts w:ascii="Calibri" w:hAnsi="Calibri"/>
           <w:sz w:val="19"/>
         </w:rPr>
-        <w:t>Decoupled Orchestration, System Design &amp; Scalability</w:t>
+        <w:t>Distributed Systems Architecture, Tensor Sharding &amp; Compute Networks, Decoupled Orchestration, Zero-Trust Communication Protocols, Proof-of-Compute Verification, System Design &amp; Scalability, Futuristic Systems Design</w:t>
       </w:r>
     </w:p>
     <w:p>
@@ -149,67 +149,7 @@
           <w:rFonts w:ascii="Calibri" w:hAnsi="Calibri"/>
           <w:sz w:val="19"/>
         </w:rPr>
-        <w:t>Multi-Agent AI Pipelines, LLM Intent Classification &amp; Routing, Prompt Engineering &amp; Chains, RAG &amp; Ground Truth Verification, Adversarial Critic Systems</w:t>
-      </w:r>
-    </w:p>
-    <w:p>
-      <w:pPr>
-        <w:spacing w:before="20" w:after="40"/>
-      </w:pPr>
-      <w:r>
-        <w:rPr>
-          <w:rFonts w:ascii="Calibri" w:hAnsi="Calibri"/>
-          <w:b/>
-          <w:sz w:val="19"/>
-        </w:rPr>
-        <w:t xml:space="preserve">Backend &amp; Cloud: </w:t>
-      </w:r>
-      <w:r>
-        <w:rPr>
-          <w:rFonts w:ascii="Calibri" w:hAnsi="Calibri"/>
-          <w:sz w:val="19"/>
-        </w:rPr>
-        <w:t>FastAPI, RESTful API Design, Asynchronous Programming (asyncio), APScheduler &amp; Task Queues</w:t>
-      </w:r>
-    </w:p>
-    <w:p>
-      <w:pPr>
-        <w:spacing w:before="20" w:after="40"/>
-      </w:pPr>
-      <w:r>
-        <w:rPr>
-          <w:rFonts w:ascii="Calibri" w:hAnsi="Calibri"/>
-          <w:b/>
-          <w:sz w:val="19"/>
-        </w:rPr>
-        <w:t xml:space="preserve">Security &amp; Systems: </w:t>
-      </w:r>
-      <w:r>
-        <w:rPr>
-          <w:rFonts w:ascii="Calibri" w:hAnsi="Calibri"/>
-          <w:sz w:val="19"/>
-        </w:rPr>
-        <w:t>Sandboxing &amp; Isolation (Firecracker)</w:t>
-      </w:r>
-    </w:p>
-    <w:p>
-      <w:pPr>
-        <w:spacing w:before="20" w:after="40"/>
-      </w:pPr>
-      <w:r>
-        <w:rPr>
-          <w:rFonts w:ascii="Calibri" w:hAnsi="Calibri"/>
-          <w:b/>
-          <w:sz w:val="19"/>
-        </w:rPr>
-        <w:t xml:space="preserve">Soft Skills: </w:t>
-      </w:r>
-      <w:r>
-        <w:rPr>
-          <w:rFonts w:ascii="Calibri" w:hAnsi="Calibri"/>
-          <w:sz w:val="19"/>
-        </w:rPr>
-        <w:t>Technical Architecture Documentation, Conceptual Simplification, Problem Decomposition</w:t>
+        <w:t>Multi-Agent AI Pipelines, AI Safety &amp; Alignment, LLM Intent Classification &amp; Routing, Prompt Engineering &amp; Chains, RAG &amp; Ground Truth Verification, Adversarial Critic Systems, Ethical AI Systems, Predictive Computational Modeling</w:t>
       </w:r>
     </w:p>
     <w:p>
@@ -227,102 +167,6 @@
           <w:sz w:val="21"/>
         </w:rPr>
         <w:t>FEATURED SYSTEMS &amp; PROJECTS</w:t>
-      </w:r>
-    </w:p>
-    <w:p>
-      <w:pPr>
-        <w:spacing w:before="80" w:after="20"/>
-      </w:pPr>
-      <w:r>
-        <w:rPr>
-          <w:rFonts w:ascii="Calibri" w:hAnsi="Calibri"/>
-          <w:b/>
-          <w:sz w:val="19"/>
-        </w:rPr>
-        <w:t>SATURDAY / SUNDAY — Architect &amp; Lead Developer</w:t>
-      </w:r>
-      <w:r>
-        <w:rPr>
-          <w:rFonts w:ascii="Calibri" w:hAnsi="Calibri"/>
-          <w:i/>
-          <w:color w:val="64748B"/>
-          <w:sz w:val="17"/>
-        </w:rPr>
-        <w:t xml:space="preserve">   (Jan 2026 - Present)</w:t>
-      </w:r>
-    </w:p>
-    <w:p>
-      <w:pPr>
-        <w:spacing w:before="0" w:after="40"/>
-      </w:pPr>
-      <w:r>
-        <w:rPr>
-          <w:rFonts w:ascii="Calibri" w:hAnsi="Calibri"/>
-          <w:i/>
-          <w:color w:val="475569"/>
-          <w:sz w:val="17"/>
-        </w:rPr>
-        <w:t>Tech Stack: Python, C++, Tensor Sharding, Zero-Trust Protocols, LAN, Tailscale VPN, Socket Programming</w:t>
-      </w:r>
-    </w:p>
-    <w:p>
-      <w:pPr>
-        <w:pStyle w:val="ListBullet"/>
-        <w:spacing w:before="0" w:after="30"/>
-      </w:pPr>
-      <w:r>
-        <w:rPr>
-          <w:rFonts w:ascii="Calibri" w:hAnsi="Calibri"/>
-          <w:sz w:val="18"/>
-        </w:rPr>
-        <w:t>Built a distributed compute network to run large local LLMs, solving hardware limitations of processing complex AI models on single devices.</w:t>
-      </w:r>
-    </w:p>
-    <w:p>
-      <w:pPr>
-        <w:pStyle w:val="ListBullet"/>
-        <w:spacing w:before="0" w:after="30"/>
-      </w:pPr>
-      <w:r>
-        <w:rPr>
-          <w:rFonts w:ascii="Calibri" w:hAnsi="Calibri"/>
-          <w:sz w:val="18"/>
-        </w:rPr>
-        <w:t>Implemented automatic hardware discovery and dynamic tensor sharding to split a single model's processing across heterogeneous Mac and Windows nodes via LAN and Tailscale VPN mesh.</w:t>
-      </w:r>
-    </w:p>
-    <w:p>
-      <w:pPr>
-        <w:pStyle w:val="ListBullet"/>
-        <w:spacing w:before="0" w:after="30"/>
-      </w:pPr>
-      <w:r>
-        <w:rPr>
-          <w:rFonts w:ascii="Calibri" w:hAnsi="Calibri"/>
-          <w:sz w:val="18"/>
-        </w:rPr>
-        <w:t>Designed a zero-trust communication protocol between nodes, utilizing proof-of-compute verification to detect and reject nodes returning corrupted or falsified matrix calculation results.</w:t>
-      </w:r>
-    </w:p>
-    <w:p>
-      <w:pPr>
-        <w:pStyle w:val="ListBullet"/>
-        <w:spacing w:before="0" w:after="40"/>
-      </w:pPr>
-      <w:r>
-        <w:rPr>
-          <w:rFonts w:ascii="Calibri" w:hAnsi="Calibri"/>
-          <w:b/>
-          <w:sz w:val="18"/>
-        </w:rPr>
-        <w:t xml:space="preserve">Key Architecture: </w:t>
-      </w:r>
-      <w:r>
-        <w:rPr>
-          <w:rFonts w:ascii="Calibri" w:hAnsi="Calibri"/>
-          <w:sz w:val="18"/>
-        </w:rPr>
-        <w:t>Decoupled coordinator-worker model with heartbeats; distributed matrix multiplication with Tailscale mesh tunnels; sub-millisecond node health checks; Byzantine fault tolerance through spot verification.</w:t>
       </w:r>
     </w:p>
     <w:p>
@@ -532,6 +376,102 @@
     </w:p>
     <w:p>
       <w:pPr>
+        <w:spacing w:before="80" w:after="20"/>
+      </w:pPr>
+      <w:r>
+        <w:rPr>
+          <w:rFonts w:ascii="Calibri" w:hAnsi="Calibri"/>
+          <w:b/>
+          <w:sz w:val="19"/>
+        </w:rPr>
+        <w:t>BioShield AI — Computational Biosafety &amp; Health Resilience Engine — Lead Researcher &amp; Architect</w:t>
+      </w:r>
+      <w:r>
+        <w:rPr>
+          <w:rFonts w:ascii="Calibri" w:hAnsi="Calibri"/>
+          <w:i/>
+          <w:color w:val="64748B"/>
+          <w:sz w:val="17"/>
+        </w:rPr>
+        <w:t xml:space="preserve">   (Jan 2026 - Present)</w:t>
+      </w:r>
+    </w:p>
+    <w:p>
+      <w:pPr>
+        <w:spacing w:before="0" w:after="40"/>
+      </w:pPr>
+      <w:r>
+        <w:rPr>
+          <w:rFonts w:ascii="Calibri" w:hAnsi="Calibri"/>
+          <w:i/>
+          <w:color w:val="475569"/>
+          <w:sz w:val="17"/>
+        </w:rPr>
+        <w:t>Tech Stack: Python, PyTorch, Predictive Modeling, Simulation Engines, FastAPI, Docker</w:t>
+      </w:r>
+    </w:p>
+    <w:p>
+      <w:pPr>
+        <w:pStyle w:val="ListBullet"/>
+        <w:spacing w:before="0" w:after="30"/>
+      </w:pPr>
+      <w:r>
+        <w:rPr>
+          <w:rFonts w:ascii="Calibri" w:hAnsi="Calibri"/>
+          <w:sz w:val="18"/>
+        </w:rPr>
+        <w:t>Engineered predictive computational modeling pipelines for simulating pathogen transmission dynamics and evaluating countermeasure strategies in real time.</w:t>
+      </w:r>
+    </w:p>
+    <w:p>
+      <w:pPr>
+        <w:pStyle w:val="ListBullet"/>
+        <w:spacing w:before="0" w:after="30"/>
+      </w:pPr>
+      <w:r>
+        <w:rPr>
+          <w:rFonts w:ascii="Calibri" w:hAnsi="Calibri"/>
+          <w:sz w:val="18"/>
+        </w:rPr>
+        <w:t>Designed distributed simulation workers to process high-throughput biological interaction datasets with deterministic validation hooks.</w:t>
+      </w:r>
+    </w:p>
+    <w:p>
+      <w:pPr>
+        <w:pStyle w:val="ListBullet"/>
+        <w:spacing w:before="0" w:after="30"/>
+      </w:pPr>
+      <w:r>
+        <w:rPr>
+          <w:rFonts w:ascii="Calibri" w:hAnsi="Calibri"/>
+          <w:sz w:val="18"/>
+        </w:rPr>
+        <w:t>Authored biosafety compliance blueprints and zero-leakage data sandboxing mechanisms for sensitive health research data.</w:t>
+      </w:r>
+    </w:p>
+    <w:p>
+      <w:pPr>
+        <w:pStyle w:val="ListBullet"/>
+        <w:spacing w:before="0" w:after="40"/>
+      </w:pPr>
+      <w:r>
+        <w:rPr>
+          <w:rFonts w:ascii="Calibri" w:hAnsi="Calibri"/>
+          <w:b/>
+          <w:sz w:val="18"/>
+        </w:rPr>
+        <w:t xml:space="preserve">Key Architecture: </w:t>
+      </w:r>
+      <w:r>
+        <w:rPr>
+          <w:rFonts w:ascii="Calibri" w:hAnsi="Calibri"/>
+          <w:sz w:val="18"/>
+        </w:rPr>
+        <w:t>Event-driven asynchronous worker pool; deterministic simulation checkpointing; isolated compute sandboxes with strict egress filtering.</w:t>
+      </w:r>
+    </w:p>
+    <w:p>
+      <w:pPr>
         <w:spacing w:before="160" w:after="60"/>
         <w:pBdr>
           <w:bottom w:val="single" w:sz="6" w:space="1" w:color="CBD5E1"/>
@@ -545,6 +485,67 @@
           <w:sz w:val="21"/>
         </w:rPr>
         <w:t>EXPERIENCE &amp; LEADERSHIP</w:t>
+      </w:r>
+    </w:p>
+    <w:p>
+      <w:pPr>
+        <w:spacing w:before="80" w:after="20"/>
+      </w:pPr>
+      <w:r>
+        <w:rPr>
+          <w:rFonts w:ascii="Calibri" w:hAnsi="Calibri"/>
+          <w:b/>
+          <w:sz w:val="19"/>
+        </w:rPr>
+        <w:t>SecureVerse — Founder &amp; Lead Architect</w:t>
+      </w:r>
+      <w:r>
+        <w:rPr>
+          <w:rFonts w:ascii="Calibri" w:hAnsi="Calibri"/>
+          <w:i/>
+          <w:color w:val="64748B"/>
+          <w:sz w:val="17"/>
+        </w:rPr>
+        <w:t xml:space="preserve">   (Oct 2025 - Present)</w:t>
+      </w:r>
+    </w:p>
+    <w:p>
+      <w:pPr>
+        <w:pStyle w:val="ListBullet"/>
+        <w:spacing w:before="0" w:after="30"/>
+      </w:pPr>
+      <w:r>
+        <w:rPr>
+          <w:rFonts w:ascii="Calibri" w:hAnsi="Calibri"/>
+          <w:sz w:val="18"/>
+        </w:rPr>
+        <w:t>Founded SecureVerse to engineer decentralized zero-trust identity verification architectures, AI safety tooling, and privacy-preserving computing systems.</w:t>
+      </w:r>
+    </w:p>
+    <w:p>
+      <w:pPr>
+        <w:pStyle w:val="ListBullet"/>
+        <w:spacing w:before="0" w:after="30"/>
+      </w:pPr>
+      <w:r>
+        <w:rPr>
+          <w:rFonts w:ascii="Calibri" w:hAnsi="Calibri"/>
+          <w:sz w:val="18"/>
+        </w:rPr>
+        <w:t>Formulated end-to-end cryptographic trust chains, automated audit mechanisms, and threat mitigation models recognized in national engineering challenges.</w:t>
+      </w:r>
+    </w:p>
+    <w:p>
+      <w:pPr>
+        <w:pStyle w:val="ListBullet"/>
+        <w:spacing w:before="0" w:after="30"/>
+      </w:pPr>
+      <w:r>
+        <w:rPr>
+          <w:rFonts w:ascii="Calibri" w:hAnsi="Calibri"/>
+          <w:sz w:val="18"/>
+        </w:rPr>
+        <w:t>Directed technology roadmap, leading proof-of-concept development and cross-functional prototype verification.</w:t>
       </w:r>
     </w:p>
     <w:p>
@@ -873,14 +874,14 @@
           <w:b/>
           <w:sz w:val="18"/>
         </w:rPr>
-        <w:t xml:space="preserve">Advanced Backend Engineering &amp; Distributed Systems Architecture </w:t>
+        <w:t xml:space="preserve">Responsible Disclosure &amp; Security Research Recognition </w:t>
       </w:r>
       <w:r>
         <w:rPr>
           <w:rFonts w:ascii="Calibri" w:hAnsi="Calibri"/>
           <w:sz w:val="18"/>
         </w:rPr>
-        <w:t>— Engineering Systems Council (2025)</w:t>
+        <w:t>— HackerOne (2025)</w:t>
       </w:r>
     </w:p>
     <w:p>

</xml_diff>

<commit_message>
feat: enrich portfolio DB, sheets, and resumes with full GitHub project inventory
</commit_message>
<xml_diff>
--- a/sample_data/generated_resumes/Resume_AI_MultiAgent_Engineer.docx
+++ b/sample_data/generated_resumes/Resume_AI_MultiAgent_Engineer.docx
@@ -72,7 +72,7 @@
           <w:rFonts w:ascii="Calibri" w:hAnsi="Calibri"/>
           <w:sz w:val="19"/>
         </w:rPr>
-        <w:t>Distributed systems architect and Founder of SecureVerse specializing in multi-agent orchestration, LLM intent routing, predictive computational modeling, and AI safety verification pipelines.</w:t>
+        <w:t>AI Systems Architect and Founder of SecureVerse specializing in multi-agent orchestration, parallel persona fan-out, LLM intent routing, progressive RAG, and cloud-native serverless inference pipelines.</w:t>
       </w:r>
     </w:p>
     <w:p>
@@ -109,7 +109,7 @@
           <w:rFonts w:ascii="Calibri" w:hAnsi="Calibri"/>
           <w:sz w:val="19"/>
         </w:rPr>
-        <w:t>Python, C++, TypeScript / JavaScript, SQL (PostgreSQL, SQLite), Bash / Shell Scripting</w:t>
+        <w:t>Python, C++, Rust, Java, TypeScript / JavaScript, SQL (PostgreSQL, SQLite), Bash / Shell Scripting</w:t>
       </w:r>
     </w:p>
     <w:p>
@@ -129,7 +129,7 @@
           <w:rFonts w:ascii="Calibri" w:hAnsi="Calibri"/>
           <w:sz w:val="19"/>
         </w:rPr>
-        <w:t>Distributed Systems Architecture, Tensor Sharding &amp; Compute Networks, Decoupled Orchestration, Zero-Trust Communication Protocols, Proof-of-Compute Verification, System Design &amp; Scalability, Futuristic Systems Design</w:t>
+        <w:t>Distributed Systems Architecture, Tensor Sharding &amp; Compute Networks, Decoupled Orchestration, Zero-Trust Communication Protocols, Proof-of-Compute Verification, System Design &amp; Scalability, Soroban Smart Contracts (Stellar), Futuristic Systems Design</w:t>
       </w:r>
     </w:p>
     <w:p>
@@ -149,7 +149,7 @@
           <w:rFonts w:ascii="Calibri" w:hAnsi="Calibri"/>
           <w:sz w:val="19"/>
         </w:rPr>
-        <w:t>Multi-Agent AI Pipelines, AI Safety &amp; Alignment, LLM Intent Classification &amp; Routing, Prompt Engineering &amp; Chains, RAG &amp; Ground Truth Verification, Adversarial Critic Systems, Ethical AI Systems, Predictive Computational Modeling</w:t>
+        <w:t>Multi-Agent AI Pipelines, AI Safety &amp; Alignment, LLM Intent Classification &amp; Routing, Prompt Engineering &amp; Chains, Progressive RAG &amp; Memory Layers, Adversarial Critic Systems, Ethical AI Systems, Predictive Computational Modeling</w:t>
       </w:r>
     </w:p>
     <w:p>
@@ -288,102 +288,6 @@
           <w:b/>
           <w:sz w:val="19"/>
         </w:rPr>
-        <w:t>EduOS — AI Curiosity-First Education Engine — Creator &amp; Lead Developer</w:t>
-      </w:r>
-      <w:r>
-        <w:rPr>
-          <w:rFonts w:ascii="Calibri" w:hAnsi="Calibri"/>
-          <w:i/>
-          <w:color w:val="64748B"/>
-          <w:sz w:val="17"/>
-        </w:rPr>
-        <w:t xml:space="preserve">   (Nov 2025 - Feb 2026)</w:t>
-      </w:r>
-    </w:p>
-    <w:p>
-      <w:pPr>
-        <w:spacing w:before="0" w:after="40"/>
-      </w:pPr>
-      <w:r>
-        <w:rPr>
-          <w:rFonts w:ascii="Calibri" w:hAnsi="Calibri"/>
-          <w:i/>
-          <w:color w:val="475569"/>
-          <w:sz w:val="17"/>
-        </w:rPr>
-        <w:t>Tech Stack: Python, FastAPI, WhatsApp Cloud API, Prompt Chains, Knowledge Graph, SQLite</w:t>
-      </w:r>
-    </w:p>
-    <w:p>
-      <w:pPr>
-        <w:pStyle w:val="ListBullet"/>
-        <w:spacing w:before="0" w:after="30"/>
-      </w:pPr>
-      <w:r>
-        <w:rPr>
-          <w:rFonts w:ascii="Calibri" w:hAnsi="Calibri"/>
-          <w:sz w:val="18"/>
-        </w:rPr>
-        <w:t>Developed an AI education platform featuring an algorithmic 'pinch engine' that generates one high-value conceptual knowledge connection per day for students based on their curiosity graph.</w:t>
-      </w:r>
-    </w:p>
-    <w:p>
-      <w:pPr>
-        <w:pStyle w:val="ListBullet"/>
-        <w:spacing w:before="0" w:after="30"/>
-      </w:pPr>
-      <w:r>
-        <w:rPr>
-          <w:rFonts w:ascii="Calibri" w:hAnsi="Calibri"/>
-          <w:sz w:val="18"/>
-        </w:rPr>
-        <w:t>Engineered core logic prioritizing curiosity-driven concept delivery before standard syllabus notes, boosting daily student engagement metrics.</w:t>
-      </w:r>
-    </w:p>
-    <w:p>
-      <w:pPr>
-        <w:pStyle w:val="ListBullet"/>
-        <w:spacing w:before="0" w:after="30"/>
-      </w:pPr>
-      <w:r>
-        <w:rPr>
-          <w:rFonts w:ascii="Calibri" w:hAnsi="Calibri"/>
-          <w:sz w:val="18"/>
-        </w:rPr>
-        <w:t>Built WhatsApp API integration, deliberately decoupled during development with an isolated rate-limiter and queue to prevent unauthorized broadcasting.</w:t>
-      </w:r>
-    </w:p>
-    <w:p>
-      <w:pPr>
-        <w:pStyle w:val="ListBullet"/>
-        <w:spacing w:before="0" w:after="40"/>
-      </w:pPr>
-      <w:r>
-        <w:rPr>
-          <w:rFonts w:ascii="Calibri" w:hAnsi="Calibri"/>
-          <w:b/>
-          <w:sz w:val="18"/>
-        </w:rPr>
-        <w:t xml:space="preserve">Key Architecture: </w:t>
-      </w:r>
-      <w:r>
-        <w:rPr>
-          <w:rFonts w:ascii="Calibri" w:hAnsi="Calibri"/>
-          <w:sz w:val="18"/>
-        </w:rPr>
-        <w:t>Curiosity graph mapping; asynchronous outbound dispatch with token bucket rate limiting; deterministic prompt chain templates with ground-truth validation.</w:t>
-      </w:r>
-    </w:p>
-    <w:p>
-      <w:pPr>
-        <w:spacing w:before="80" w:after="20"/>
-      </w:pPr>
-      <w:r>
-        <w:rPr>
-          <w:rFonts w:ascii="Calibri" w:hAnsi="Calibri"/>
-          <w:b/>
-          <w:sz w:val="19"/>
-        </w:rPr>
         <w:t>BioShield AI — Computational Biosafety &amp; Health Resilience Engine — Lead Researcher &amp; Architect</w:t>
       </w:r>
       <w:r>
@@ -468,6 +372,198 @@
           <w:sz w:val="18"/>
         </w:rPr>
         <w:t>Event-driven asynchronous worker pool; deterministic simulation checkpointing; isolated compute sandboxes with strict egress filtering.</w:t>
+      </w:r>
+    </w:p>
+    <w:p>
+      <w:pPr>
+        <w:spacing w:before="80" w:after="20"/>
+      </w:pPr>
+      <w:r>
+        <w:rPr>
+          <w:rFonts w:ascii="Calibri" w:hAnsi="Calibri"/>
+          <w:b/>
+          <w:sz w:val="19"/>
+        </w:rPr>
+        <w:t>Cognitive Diplomat — Multi-Agent Negotiation Predictor &amp; RAG — Lead AI Systems Architect</w:t>
+      </w:r>
+      <w:r>
+        <w:rPr>
+          <w:rFonts w:ascii="Calibri" w:hAnsi="Calibri"/>
+          <w:i/>
+          <w:color w:val="64748B"/>
+          <w:sz w:val="17"/>
+        </w:rPr>
+        <w:t xml:space="preserve">   (Sep 2026 - Oct 2026)</w:t>
+      </w:r>
+    </w:p>
+    <w:p>
+      <w:pPr>
+        <w:spacing w:before="0" w:after="40"/>
+      </w:pPr>
+      <w:r>
+        <w:rPr>
+          <w:rFonts w:ascii="Calibri" w:hAnsi="Calibri"/>
+          <w:i/>
+          <w:color w:val="475569"/>
+          <w:sz w:val="17"/>
+        </w:rPr>
+        <w:t>Tech Stack: TypeScript, Express, Ollama LLM, Progressive RAG, In-Memory LRU Cache, Vector-Keyword Hybrid Retrieval</w:t>
+      </w:r>
+    </w:p>
+    <w:p>
+      <w:pPr>
+        <w:pStyle w:val="ListBullet"/>
+        <w:spacing w:before="0" w:after="30"/>
+      </w:pPr>
+      <w:r>
+        <w:rPr>
+          <w:rFonts w:ascii="Calibri" w:hAnsi="Calibri"/>
+          <w:sz w:val="18"/>
+        </w:rPr>
+        <w:t>Engineered a high-performance negotiation next-turn prediction engine orchestrating a 3-persona parallel agent fan-out via Promise.all.</w:t>
+      </w:r>
+    </w:p>
+    <w:p>
+      <w:pPr>
+        <w:pStyle w:val="ListBullet"/>
+        <w:spacing w:before="0" w:after="30"/>
+      </w:pPr>
+      <w:r>
+        <w:rPr>
+          <w:rFonts w:ascii="Calibri" w:hAnsi="Calibri"/>
+          <w:sz w:val="18"/>
+        </w:rPr>
+        <w:t>Implemented a progressive RAG layer over tactical negotiation playbooks with keyword-hybrid retrieval and LRU-bounded memory.</w:t>
+      </w:r>
+    </w:p>
+    <w:p>
+      <w:pPr>
+        <w:pStyle w:val="ListBullet"/>
+        <w:spacing w:before="0" w:after="30"/>
+      </w:pPr>
+      <w:r>
+        <w:rPr>
+          <w:rFonts w:ascii="Calibri" w:hAnsi="Calibri"/>
+          <w:sz w:val="18"/>
+        </w:rPr>
+        <w:t>Enforced deterministic synthesis using temperature=0 and fixed seed assertions with strict confidence score clamping.</w:t>
+      </w:r>
+    </w:p>
+    <w:p>
+      <w:pPr>
+        <w:pStyle w:val="ListBullet"/>
+        <w:spacing w:before="0" w:after="40"/>
+      </w:pPr>
+      <w:r>
+        <w:rPr>
+          <w:rFonts w:ascii="Calibri" w:hAnsi="Calibri"/>
+          <w:b/>
+          <w:sz w:val="18"/>
+        </w:rPr>
+        <w:t xml:space="preserve">Key Architecture: </w:t>
+      </w:r>
+      <w:r>
+        <w:rPr>
+          <w:rFonts w:ascii="Calibri" w:hAnsi="Calibri"/>
+          <w:sz w:val="18"/>
+        </w:rPr>
+        <w:t>Parallel agent fan-out; deterministic LLM synthesis; 500-entry LRU per-request memory cache; full requirement traceability matrix.</w:t>
+      </w:r>
+    </w:p>
+    <w:p>
+      <w:pPr>
+        <w:spacing w:before="80" w:after="20"/>
+      </w:pPr>
+      <w:r>
+        <w:rPr>
+          <w:rFonts w:ascii="Calibri" w:hAnsi="Calibri"/>
+          <w:b/>
+          <w:sz w:val="19"/>
+        </w:rPr>
+        <w:t>Topcoder AI Profile Video Pipeline — Async Cloud-Native Engine — Cloud &amp; AI Pipeline Architect</w:t>
+      </w:r>
+      <w:r>
+        <w:rPr>
+          <w:rFonts w:ascii="Calibri" w:hAnsi="Calibri"/>
+          <w:i/>
+          <w:color w:val="64748B"/>
+          <w:sz w:val="17"/>
+        </w:rPr>
+        <w:t xml:space="preserve">   (Aug 2026 - Sep 2026)</w:t>
+      </w:r>
+    </w:p>
+    <w:p>
+      <w:pPr>
+        <w:spacing w:before="0" w:after="40"/>
+      </w:pPr>
+      <w:r>
+        <w:rPr>
+          <w:rFonts w:ascii="Calibri" w:hAnsi="Calibri"/>
+          <w:i/>
+          <w:color w:val="475569"/>
+          <w:sz w:val="17"/>
+        </w:rPr>
+        <w:t>Tech Stack: Python, AWS Lambda, MoviePy/FFmpeg, Streamlit, Asynchronous Orchestration, Docker, Render</w:t>
+      </w:r>
+    </w:p>
+    <w:p>
+      <w:pPr>
+        <w:pStyle w:val="ListBullet"/>
+        <w:spacing w:before="0" w:after="30"/>
+      </w:pPr>
+      <w:r>
+        <w:rPr>
+          <w:rFonts w:ascii="Calibri" w:hAnsi="Calibri"/>
+          <w:sz w:val="18"/>
+        </w:rPr>
+        <w:t>Architected an event-driven serverless video processing pipeline that automatically converts raw member intro footage into professional branded Topcoder videos.</w:t>
+      </w:r>
+    </w:p>
+    <w:p>
+      <w:pPr>
+        <w:pStyle w:val="ListBullet"/>
+        <w:spacing w:before="0" w:after="30"/>
+      </w:pPr>
+      <w:r>
+        <w:rPr>
+          <w:rFonts w:ascii="Calibri" w:hAnsi="Calibri"/>
+          <w:sz w:val="18"/>
+        </w:rPr>
+        <w:t>Built an AWS Lambda queue consumer for scalable background transcription, caption overlay, and audio normalization.</w:t>
+      </w:r>
+    </w:p>
+    <w:p>
+      <w:pPr>
+        <w:pStyle w:val="ListBullet"/>
+        <w:spacing w:before="0" w:after="30"/>
+      </w:pPr>
+      <w:r>
+        <w:rPr>
+          <w:rFonts w:ascii="Calibri" w:hAnsi="Calibri"/>
+          <w:sz w:val="18"/>
+        </w:rPr>
+        <w:t>Delivered an interactive Streamlit operational dashboard for cost, performance, and compute budget analysis.</w:t>
+      </w:r>
+    </w:p>
+    <w:p>
+      <w:pPr>
+        <w:pStyle w:val="ListBullet"/>
+        <w:spacing w:before="0" w:after="40"/>
+      </w:pPr>
+      <w:r>
+        <w:rPr>
+          <w:rFonts w:ascii="Calibri" w:hAnsi="Calibri"/>
+          <w:b/>
+          <w:sz w:val="18"/>
+        </w:rPr>
+        <w:t xml:space="preserve">Key Architecture: </w:t>
+      </w:r>
+      <w:r>
+        <w:rPr>
+          <w:rFonts w:ascii="Calibri" w:hAnsi="Calibri"/>
+          <w:sz w:val="18"/>
+        </w:rPr>
+        <w:t>Decoupled queue-driven serverless architecture; dynamic FFmpeg rendering pipeline; budget and resource observability dashboard.</w:t>
       </w:r>
     </w:p>
     <w:p>

</xml_diff>